<commit_message>
fix(docs): correo oficial de habeas data → habeasdata@risksint.com
</commit_message>
<xml_diff>
--- a/public/docs/Politica-Tratamiento-Datos.docx
+++ b/public/docs/Politica-Tratamiento-Datos.docx
@@ -404,7 +404,43 @@
           <w:sz w:val="22"/>
           <w:szCs w:val="22"/>
         </w:rPr>
-        <w:t xml:space="preserve">Correo electrónico:</w:t>
+        <w:t xml:space="preserve">Correo para asuntos de habeas data:</w:t>
+      </w:r>
+      <w:r>
+        <w:rPr>
+          <w:rFonts w:ascii="Inter" w:cs="Inter" w:eastAsia="Inter" w:hAnsi="Inter"/>
+          <w:b w:val="false"/>
+          <w:bCs w:val="false"/>
+          <w:i w:val="false"/>
+          <w:iCs w:val="false"/>
+          <w:color w:val="1F2937"/>
+          <w:sz w:val="22"/>
+          <w:szCs w:val="22"/>
+        </w:rPr>
+        <w:t xml:space="preserve">habeasdata@risksint.com</w:t>
+      </w:r>
+    </w:p>
+    <w:p>
+      <w:pPr>
+        <w:pStyle w:val="ListParagraph"/>
+        <w:numPr>
+          <w:ilvl w:val="0"/>
+          <w:numId w:val="2"/>
+        </w:numPr>
+        <w:spacing w:after="40" w:before="40"/>
+      </w:pPr>
+      <w:r>
+        <w:rPr>
+          <w:rFonts w:ascii="Inter" w:cs="Inter" w:eastAsia="Inter" w:hAnsi="Inter"/>
+          <w:b/>
+          <w:bCs/>
+          <w:i w:val="false"/>
+          <w:iCs w:val="false"/>
+          <w:color w:val="1F2937"/>
+          <w:sz w:val="22"/>
+          <w:szCs w:val="22"/>
+        </w:rPr>
+        <w:t xml:space="preserve">Correos institucionales:</w:t>
       </w:r>
       <w:r>
         <w:rPr>
@@ -1989,7 +2025,7 @@
           <w:sz w:val="22"/>
           <w:szCs w:val="22"/>
         </w:rPr>
-        <w:t xml:space="preserve">gerencia@risksint.com (con copia obligatoria a formacion@risksint.com).</w:t>
+        <w:t xml:space="preserve">habeasdata@risksint.com (canal oficial para ejercer derechos de habeas data), con copia opcional a gerencia@risksint.com.</w:t>
       </w:r>
     </w:p>
     <w:p>

</xml_diff>